<commit_message>
Fix stacked OOXML layout: render both misras as separate indented rows
Previously baytRowsOoxml() in stacked mode only emitted the sadr row
and silently dropped the ajuz. Two fixes:

Old-format bayt: split the combined `!bayt.ajuz || stacked` guard into
separate branches — no-ajuz stays solo, stacked now emits two rows:
sadr centered (no indent), ajuz centered with w:ind w:right="640" (32pt),
matching the padding-right:32pt offset used in the HTML stacked path.

Row-type multi-misra: stacked now emits one row per misra (first at
true center, rest with 640-twips indent) instead of only misras[0].

Add optional indTwips param to misraParaXml() and soloRow() to carry
the indent through without touching the non-stacked paths.

Co-Authored-By: Claude Sonnet 4.6 <noreply@anthropic.com>
</commit_message>
<xml_diff>
--- a/test-documents/corpus-test.docx
+++ b/test-documents/corpus-test.docx
@@ -533,6 +533,43 @@
                 <w:rtl/>
               </w:rPr>
               <w:t xml:space="preserve">إذا غامَرتَ في شَرَفٍ مَرومِ</w:t>
+            </w:r>
+          </w:p>
+        </w:tc>
+        <w:tc>
+          <w:tcPr>
+            <w:gridSpan w:val="2"/>
+            <w:tcW w:w="2674" w:type="dxa"/>
+          </w:tcPr>
+          <w:p/>
+        </w:tc>
+      </w:tr>
+      <w:tr>
+        <w:tc>
+          <w:tcPr>
+            <w:gridSpan w:val="2"/>
+            <w:tcW w:w="2674" w:type="dxa"/>
+          </w:tcPr>
+          <w:p/>
+        </w:tc>
+        <w:tc>
+          <w:tcPr>
+            <w:gridSpan w:val="3"/>
+            <w:tcW w:w="4011" w:type="dxa"/>
+            <w:vAlign w:val="bottom"/>
+          </w:tcPr>
+          <w:p>
+            <w:pPr>
+              <w:bidi/>
+              <w:spacing w:after="80"/>
+              <w:jc w:val="center"/>
+              <w:ind w:right="640"/>
+            </w:pPr>
+            <w:r>
+              <w:rPr>
+                <w:rtl/>
+              </w:rPr>
+              <w:t xml:space="preserve">فَلا تَقنَع بما دونَ النُّجومِ</w:t>
             </w:r>
           </w:p>
         </w:tc>
@@ -3419,6 +3456,43 @@
           <w:p/>
         </w:tc>
       </w:tr>
+      <w:tr>
+        <w:tc>
+          <w:tcPr>
+            <w:gridSpan w:val="2"/>
+            <w:tcW w:w="2674" w:type="dxa"/>
+          </w:tcPr>
+          <w:p/>
+        </w:tc>
+        <w:tc>
+          <w:tcPr>
+            <w:gridSpan w:val="3"/>
+            <w:tcW w:w="4011" w:type="dxa"/>
+            <w:vAlign w:val="bottom"/>
+          </w:tcPr>
+          <w:p>
+            <w:pPr>
+              <w:bidi/>
+              <w:spacing w:after="80"/>
+              <w:jc w:val="center"/>
+              <w:ind w:right="640"/>
+            </w:pPr>
+            <w:r>
+              <w:rPr>
+                <w:rtl/>
+              </w:rPr>
+              <w:t xml:space="preserve">آخر اس درد کی دوا کیا ہے</w:t>
+            </w:r>
+          </w:p>
+        </w:tc>
+        <w:tc>
+          <w:tcPr>
+            <w:gridSpan w:val="2"/>
+            <w:tcW w:w="2674" w:type="dxa"/>
+          </w:tcPr>
+          <w:p/>
+        </w:tc>
+      </w:tr>
     </w:tbl>
     <w:p/>
     <w:tbl>
@@ -3480,6 +3554,43 @@
           <w:p/>
         </w:tc>
       </w:tr>
+      <w:tr>
+        <w:tc>
+          <w:tcPr>
+            <w:gridSpan w:val="2"/>
+            <w:tcW w:w="2674" w:type="dxa"/>
+          </w:tcPr>
+          <w:p/>
+        </w:tc>
+        <w:tc>
+          <w:tcPr>
+            <w:gridSpan w:val="3"/>
+            <w:tcW w:w="4011" w:type="dxa"/>
+            <w:vAlign w:val="bottom"/>
+          </w:tcPr>
+          <w:p>
+            <w:pPr>
+              <w:bidi/>
+              <w:spacing w:after="80"/>
+              <w:jc w:val="center"/>
+              <w:ind w:right="640"/>
+            </w:pPr>
+            <w:r>
+              <w:rPr>
+                <w:rtl/>
+              </w:rPr>
+              <w:t xml:space="preserve">یا الہی یہ ماجرا کیا ہے</w:t>
+            </w:r>
+          </w:p>
+        </w:tc>
+        <w:tc>
+          <w:tcPr>
+            <w:gridSpan w:val="2"/>
+            <w:tcW w:w="2674" w:type="dxa"/>
+          </w:tcPr>
+          <w:p/>
+        </w:tc>
+      </w:tr>
     </w:tbl>
     <w:p/>
     <w:tbl>
@@ -3530,6 +3641,43 @@
                 <w:rtl/>
               </w:rPr>
               <w:t xml:space="preserve">میں بھی منہ میں زبان رکھتا ہوں</w:t>
+            </w:r>
+          </w:p>
+        </w:tc>
+        <w:tc>
+          <w:tcPr>
+            <w:gridSpan w:val="2"/>
+            <w:tcW w:w="2674" w:type="dxa"/>
+          </w:tcPr>
+          <w:p/>
+        </w:tc>
+      </w:tr>
+      <w:tr>
+        <w:tc>
+          <w:tcPr>
+            <w:gridSpan w:val="2"/>
+            <w:tcW w:w="2674" w:type="dxa"/>
+          </w:tcPr>
+          <w:p/>
+        </w:tc>
+        <w:tc>
+          <w:tcPr>
+            <w:gridSpan w:val="3"/>
+            <w:tcW w:w="4011" w:type="dxa"/>
+            <w:vAlign w:val="bottom"/>
+          </w:tcPr>
+          <w:p>
+            <w:pPr>
+              <w:bidi/>
+              <w:spacing w:after="80"/>
+              <w:jc w:val="center"/>
+              <w:ind w:right="640"/>
+            </w:pPr>
+            <w:r>
+              <w:rPr>
+                <w:rtl/>
+              </w:rPr>
+              <w:t xml:space="preserve">کاش پوچھو کہ مدعا کیا ہے</w:t>
             </w:r>
           </w:p>
         </w:tc>

</xml_diff>

<commit_message>
Fix stacked RTL indent direction: use w:ind w:left instead of w:right
In a <w:bidi/> paragraph, w:ind w:right is the START-side indent
(right = start in RTL), which shifts the ajuz center to the LEFT —
placing the sadr visually AHEAD of the ajuz in RTL reading direction.

Swapping to w:ind w:left (END-side indent in RTL) shifts the ajuz
center to the RIGHT instead, so the second hemistich steps rightward
from the first — the natural staircase direction for RTL poetry.

Co-Authored-By: Claude Sonnet 4.6 <noreply@anthropic.com>
</commit_message>
<xml_diff>
--- a/test-documents/corpus-test.docx
+++ b/test-documents/corpus-test.docx
@@ -563,7 +563,7 @@
               <w:bidi/>
               <w:spacing w:after="80"/>
               <w:jc w:val="center"/>
-              <w:ind w:right="640"/>
+              <w:ind w:left="640"/>
             </w:pPr>
             <w:r>
               <w:rPr>
@@ -3475,7 +3475,7 @@
               <w:bidi/>
               <w:spacing w:after="80"/>
               <w:jc w:val="center"/>
-              <w:ind w:right="640"/>
+              <w:ind w:left="640"/>
             </w:pPr>
             <w:r>
               <w:rPr>
@@ -3573,7 +3573,7 @@
               <w:bidi/>
               <w:spacing w:after="80"/>
               <w:jc w:val="center"/>
-              <w:ind w:right="640"/>
+              <w:ind w:left="640"/>
             </w:pPr>
             <w:r>
               <w:rPr>
@@ -3671,7 +3671,7 @@
               <w:bidi/>
               <w:spacing w:after="80"/>
               <w:jc w:val="center"/>
-              <w:ind w:right="640"/>
+              <w:ind w:left="640"/>
             </w:pPr>
             <w:r>
               <w:rPr>

</xml_diff>

<commit_message>
Implement spacing mode OOXML justification via w:jc both
justifyMode:'spacing' and 'css' were no-ops in the OOXML path — justifyText()
skipped them and misraParaXml() still emitted right/left alignment with no
word spacing applied to the Word document.

Fix: when justifyMode is 'spacing' or 'css', misraParaXml() emits
<w:jc w:val="both"/> for sadr/ajuz cells (right/left aligned). This hands
justification to Word's word-spacing algorithm rather than our custom
tatweel insertion — the correct mechanism for Nastaliq, where tatweels
are inappropriate, as well as for any font where spacing is preferred.
Centred solo rows are excluded (they stay centered).

Add Nastaliq spacing-mode and Arabic-serif spacing-mode sections to
the test document for visual verification.

Co-Authored-By: Claude Sonnet 4.6 <noreply@anthropic.com>
</commit_message>
<xml_diff>
--- a/test-documents/corpus-test.docx
+++ b/test-documents/corpus-test.docx
@@ -1868,7 +1868,7 @@
           <w:sz w:val="22"/>
           <w:szCs w:val="22"/>
         </w:rPr>
-        <w:t>Iqbal — single couplet, Nastaliq</w:t>
+        <w:t>Iqbal — single couplet, Nastaliq (no justification)</w:t>
       </w:r>
     </w:p>
     <w:p>
@@ -1956,6 +1956,577 @@
                 <w:rFonts w:cs="Noto Nastaliq Urdu"/>
               </w:rPr>
               <w:t xml:space="preserve">خدا بندے سے خود پوچھے بتا تیری رضا کیا ہے</w:t>
+            </w:r>
+          </w:p>
+        </w:tc>
+      </w:tr>
+    </w:tbl>
+    <w:p>
+      <w:pPr>
+        <w:spacing w:before="200" w:after="60"/>
+      </w:pPr>
+      <w:r>
+        <w:rPr>
+          <w:b/>
+          <w:i/>
+          <w:sz w:val="22"/>
+          <w:szCs w:val="22"/>
+        </w:rPr>
+        <w:t>Iqbal — Nastaliq, spacing mode (w:jc both — Word word-spacing)</w:t>
+      </w:r>
+    </w:p>
+    <w:tbl>
+      <w:tblPr>
+        <w:tblW w:w="0" w:type="auto"/>
+        <w:jc w:val="center"/>
+        <w:tblBorders>
+          <w:top w:val="none" w:sz="0" w:space="0" w:color="auto"/>
+          <w:left w:val="none" w:sz="0" w:space="0" w:color="auto"/>
+          <w:bottom w:val="none" w:sz="0" w:space="0" w:color="auto"/>
+          <w:right w:val="none" w:sz="0" w:space="0" w:color="auto"/>
+          <w:insideH w:val="none" w:sz="0" w:space="0" w:color="auto"/>
+          <w:insideV w:val="none" w:sz="0" w:space="0" w:color="auto"/>
+        </w:tblBorders>
+        <w:bidiVisual/>
+      </w:tblPr>
+      <w:tblGrid>
+        <w:gridCol w:w="1337"/>
+        <w:gridCol w:w="1337"/>
+        <w:gridCol w:w="1337"/>
+        <w:gridCol w:w="1337"/>
+        <w:gridCol w:w="1337"/>
+        <w:gridCol w:w="1337"/>
+        <w:gridCol w:w="1337"/>
+      </w:tblGrid>
+      <w:tr>
+        <w:tc>
+          <w:tcPr>
+            <w:gridSpan w:val="3"/>
+            <w:tcW w:w="4011" w:type="dxa"/>
+            <w:vAlign w:val="bottom"/>
+          </w:tcPr>
+          <w:p>
+            <w:pPr>
+              <w:bidi/>
+              <w:spacing w:after="80"/>
+              <w:jc w:val="both"/>
+            </w:pPr>
+            <w:r>
+              <w:rPr>
+                <w:rtl/>
+                <w:rFonts w:cs="Noto Nastaliq Urdu"/>
+              </w:rPr>
+              <w:t xml:space="preserve">خودی کو کر بلند اتنا کہ ہر تقدیر سے پہلے</w:t>
+            </w:r>
+          </w:p>
+        </w:tc>
+        <w:tc>
+          <w:tcPr>
+            <w:gridSpan w:val="1"/>
+            <w:tcW w:w="1337" w:type="dxa"/>
+          </w:tcPr>
+          <w:p/>
+        </w:tc>
+        <w:tc>
+          <w:tcPr>
+            <w:gridSpan w:val="3"/>
+            <w:tcW w:w="4011" w:type="dxa"/>
+            <w:vAlign w:val="bottom"/>
+          </w:tcPr>
+          <w:p>
+            <w:pPr>
+              <w:bidi/>
+              <w:spacing w:after="80"/>
+              <w:jc w:val="both"/>
+            </w:pPr>
+            <w:r>
+              <w:rPr>
+                <w:rtl/>
+                <w:rFonts w:cs="Noto Nastaliq Urdu"/>
+              </w:rPr>
+              <w:t xml:space="preserve">خدا بندے سے خود پوچھے بتا تیری رضا کیا ہے</w:t>
+            </w:r>
+          </w:p>
+        </w:tc>
+      </w:tr>
+    </w:tbl>
+    <w:p>
+      <w:pPr>
+        <w:spacing w:before="200" w:after="60"/>
+      </w:pPr>
+      <w:r>
+        <w:rPr>
+          <w:b/>
+          <w:i/>
+          <w:sz w:val="22"/>
+          <w:szCs w:val="22"/>
+        </w:rPr>
+        <w:t>Ghalib ghazal — Nastaliq, spacing mode (3 bayts)</w:t>
+      </w:r>
+    </w:p>
+    <w:tbl>
+      <w:tblPr>
+        <w:tblW w:w="0" w:type="auto"/>
+        <w:jc w:val="center"/>
+        <w:tblBorders>
+          <w:top w:val="none" w:sz="0" w:space="0" w:color="auto"/>
+          <w:left w:val="none" w:sz="0" w:space="0" w:color="auto"/>
+          <w:bottom w:val="none" w:sz="0" w:space="0" w:color="auto"/>
+          <w:right w:val="none" w:sz="0" w:space="0" w:color="auto"/>
+          <w:insideH w:val="none" w:sz="0" w:space="0" w:color="auto"/>
+          <w:insideV w:val="none" w:sz="0" w:space="0" w:color="auto"/>
+        </w:tblBorders>
+        <w:bidiVisual/>
+      </w:tblPr>
+      <w:tblGrid>
+        <w:gridCol w:w="1337"/>
+        <w:gridCol w:w="1337"/>
+        <w:gridCol w:w="1337"/>
+        <w:gridCol w:w="1337"/>
+        <w:gridCol w:w="1337"/>
+        <w:gridCol w:w="1337"/>
+        <w:gridCol w:w="1337"/>
+      </w:tblGrid>
+      <w:tr>
+        <w:tc>
+          <w:tcPr>
+            <w:gridSpan w:val="3"/>
+            <w:tcW w:w="4011" w:type="dxa"/>
+            <w:vAlign w:val="bottom"/>
+          </w:tcPr>
+          <w:p>
+            <w:pPr>
+              <w:bidi/>
+              <w:spacing w:after="80"/>
+              <w:jc w:val="both"/>
+            </w:pPr>
+            <w:r>
+              <w:rPr>
+                <w:rtl/>
+                <w:rFonts w:cs="Noto Nastaliq Urdu"/>
+              </w:rPr>
+              <w:t xml:space="preserve">دل ناداں تجھے ہوا کیا ہے</w:t>
+            </w:r>
+          </w:p>
+        </w:tc>
+        <w:tc>
+          <w:tcPr>
+            <w:gridSpan w:val="1"/>
+            <w:tcW w:w="1337" w:type="dxa"/>
+          </w:tcPr>
+          <w:p/>
+        </w:tc>
+        <w:tc>
+          <w:tcPr>
+            <w:gridSpan w:val="3"/>
+            <w:tcW w:w="4011" w:type="dxa"/>
+            <w:vAlign w:val="bottom"/>
+          </w:tcPr>
+          <w:p>
+            <w:pPr>
+              <w:bidi/>
+              <w:spacing w:after="80"/>
+              <w:jc w:val="both"/>
+            </w:pPr>
+            <w:r>
+              <w:rPr>
+                <w:rtl/>
+                <w:rFonts w:cs="Noto Nastaliq Urdu"/>
+              </w:rPr>
+              <w:t xml:space="preserve">آخر اس درد کی دوا کیا ہے</w:t>
+            </w:r>
+          </w:p>
+        </w:tc>
+      </w:tr>
+    </w:tbl>
+    <w:p/>
+    <w:tbl>
+      <w:tblPr>
+        <w:tblW w:w="0" w:type="auto"/>
+        <w:jc w:val="center"/>
+        <w:tblBorders>
+          <w:top w:val="none" w:sz="0" w:space="0" w:color="auto"/>
+          <w:left w:val="none" w:sz="0" w:space="0" w:color="auto"/>
+          <w:bottom w:val="none" w:sz="0" w:space="0" w:color="auto"/>
+          <w:right w:val="none" w:sz="0" w:space="0" w:color="auto"/>
+          <w:insideH w:val="none" w:sz="0" w:space="0" w:color="auto"/>
+          <w:insideV w:val="none" w:sz="0" w:space="0" w:color="auto"/>
+        </w:tblBorders>
+        <w:bidiVisual/>
+      </w:tblPr>
+      <w:tblGrid>
+        <w:gridCol w:w="1337"/>
+        <w:gridCol w:w="1337"/>
+        <w:gridCol w:w="1337"/>
+        <w:gridCol w:w="1337"/>
+        <w:gridCol w:w="1337"/>
+        <w:gridCol w:w="1337"/>
+        <w:gridCol w:w="1337"/>
+      </w:tblGrid>
+      <w:tr>
+        <w:tc>
+          <w:tcPr>
+            <w:gridSpan w:val="3"/>
+            <w:tcW w:w="4011" w:type="dxa"/>
+            <w:vAlign w:val="bottom"/>
+          </w:tcPr>
+          <w:p>
+            <w:pPr>
+              <w:bidi/>
+              <w:spacing w:after="80"/>
+              <w:jc w:val="both"/>
+            </w:pPr>
+            <w:r>
+              <w:rPr>
+                <w:rtl/>
+                <w:rFonts w:cs="Noto Nastaliq Urdu"/>
+              </w:rPr>
+              <w:t xml:space="preserve">ہم ہیں مشتاق اور وہ بیزار</w:t>
+            </w:r>
+          </w:p>
+        </w:tc>
+        <w:tc>
+          <w:tcPr>
+            <w:gridSpan w:val="1"/>
+            <w:tcW w:w="1337" w:type="dxa"/>
+          </w:tcPr>
+          <w:p/>
+        </w:tc>
+        <w:tc>
+          <w:tcPr>
+            <w:gridSpan w:val="3"/>
+            <w:tcW w:w="4011" w:type="dxa"/>
+            <w:vAlign w:val="bottom"/>
+          </w:tcPr>
+          <w:p>
+            <w:pPr>
+              <w:bidi/>
+              <w:spacing w:after="80"/>
+              <w:jc w:val="both"/>
+            </w:pPr>
+            <w:r>
+              <w:rPr>
+                <w:rtl/>
+                <w:rFonts w:cs="Noto Nastaliq Urdu"/>
+              </w:rPr>
+              <w:t xml:space="preserve">یا الہی یہ ماجرا کیا ہے</w:t>
+            </w:r>
+          </w:p>
+        </w:tc>
+      </w:tr>
+    </w:tbl>
+    <w:p/>
+    <w:tbl>
+      <w:tblPr>
+        <w:tblW w:w="0" w:type="auto"/>
+        <w:jc w:val="center"/>
+        <w:tblBorders>
+          <w:top w:val="none" w:sz="0" w:space="0" w:color="auto"/>
+          <w:left w:val="none" w:sz="0" w:space="0" w:color="auto"/>
+          <w:bottom w:val="none" w:sz="0" w:space="0" w:color="auto"/>
+          <w:right w:val="none" w:sz="0" w:space="0" w:color="auto"/>
+          <w:insideH w:val="none" w:sz="0" w:space="0" w:color="auto"/>
+          <w:insideV w:val="none" w:sz="0" w:space="0" w:color="auto"/>
+        </w:tblBorders>
+        <w:bidiVisual/>
+      </w:tblPr>
+      <w:tblGrid>
+        <w:gridCol w:w="1337"/>
+        <w:gridCol w:w="1337"/>
+        <w:gridCol w:w="1337"/>
+        <w:gridCol w:w="1337"/>
+        <w:gridCol w:w="1337"/>
+        <w:gridCol w:w="1337"/>
+        <w:gridCol w:w="1337"/>
+      </w:tblGrid>
+      <w:tr>
+        <w:tc>
+          <w:tcPr>
+            <w:gridSpan w:val="3"/>
+            <w:tcW w:w="4011" w:type="dxa"/>
+            <w:vAlign w:val="bottom"/>
+          </w:tcPr>
+          <w:p>
+            <w:pPr>
+              <w:bidi/>
+              <w:spacing w:after="80"/>
+              <w:jc w:val="both"/>
+            </w:pPr>
+            <w:r>
+              <w:rPr>
+                <w:rtl/>
+                <w:rFonts w:cs="Noto Nastaliq Urdu"/>
+              </w:rPr>
+              <w:t xml:space="preserve">میں بھی منہ میں زبان رکھتا ہوں</w:t>
+            </w:r>
+          </w:p>
+        </w:tc>
+        <w:tc>
+          <w:tcPr>
+            <w:gridSpan w:val="1"/>
+            <w:tcW w:w="1337" w:type="dxa"/>
+          </w:tcPr>
+          <w:p/>
+        </w:tc>
+        <w:tc>
+          <w:tcPr>
+            <w:gridSpan w:val="3"/>
+            <w:tcW w:w="4011" w:type="dxa"/>
+            <w:vAlign w:val="bottom"/>
+          </w:tcPr>
+          <w:p>
+            <w:pPr>
+              <w:bidi/>
+              <w:spacing w:after="80"/>
+              <w:jc w:val="both"/>
+            </w:pPr>
+            <w:r>
+              <w:rPr>
+                <w:rtl/>
+                <w:rFonts w:cs="Noto Nastaliq Urdu"/>
+              </w:rPr>
+              <w:t xml:space="preserve">کاش پوچھو کہ مدعا کیا ہے</w:t>
+            </w:r>
+          </w:p>
+        </w:tc>
+      </w:tr>
+    </w:tbl>
+    <w:p>
+      <w:pPr>
+        <w:spacing w:before="200" w:after="60"/>
+      </w:pPr>
+      <w:r>
+        <w:rPr>
+          <w:b/>
+          <w:i/>
+          <w:sz w:val="22"/>
+          <w:szCs w:val="22"/>
+        </w:rPr>
+        <w:t>Farsi Hafiz — Arabic serif, spacing mode</w:t>
+      </w:r>
+    </w:p>
+    <w:tbl>
+      <w:tblPr>
+        <w:tblW w:w="0" w:type="auto"/>
+        <w:jc w:val="center"/>
+        <w:tblBorders>
+          <w:top w:val="none" w:sz="0" w:space="0" w:color="auto"/>
+          <w:left w:val="none" w:sz="0" w:space="0" w:color="auto"/>
+          <w:bottom w:val="none" w:sz="0" w:space="0" w:color="auto"/>
+          <w:right w:val="none" w:sz="0" w:space="0" w:color="auto"/>
+          <w:insideH w:val="none" w:sz="0" w:space="0" w:color="auto"/>
+          <w:insideV w:val="none" w:sz="0" w:space="0" w:color="auto"/>
+        </w:tblBorders>
+        <w:bidiVisual/>
+      </w:tblPr>
+      <w:tblGrid>
+        <w:gridCol w:w="1337"/>
+        <w:gridCol w:w="1337"/>
+        <w:gridCol w:w="1337"/>
+        <w:gridCol w:w="1337"/>
+        <w:gridCol w:w="1337"/>
+        <w:gridCol w:w="1337"/>
+        <w:gridCol w:w="1337"/>
+      </w:tblGrid>
+      <w:tr>
+        <w:tc>
+          <w:tcPr>
+            <w:gridSpan w:val="3"/>
+            <w:tcW w:w="4011" w:type="dxa"/>
+            <w:vAlign w:val="bottom"/>
+          </w:tcPr>
+          <w:p>
+            <w:pPr>
+              <w:bidi/>
+              <w:spacing w:after="80"/>
+              <w:jc w:val="both"/>
+            </w:pPr>
+            <w:r>
+              <w:rPr>
+                <w:rtl/>
+                <w:rFonts w:cs="Scheherazade New"/>
+              </w:rPr>
+              <w:t xml:space="preserve">بیا که قصر امل سخت سست بنیاد است</w:t>
+            </w:r>
+          </w:p>
+        </w:tc>
+        <w:tc>
+          <w:tcPr>
+            <w:gridSpan w:val="1"/>
+            <w:tcW w:w="1337" w:type="dxa"/>
+          </w:tcPr>
+          <w:p/>
+        </w:tc>
+        <w:tc>
+          <w:tcPr>
+            <w:gridSpan w:val="3"/>
+            <w:tcW w:w="4011" w:type="dxa"/>
+            <w:vAlign w:val="bottom"/>
+          </w:tcPr>
+          <w:p>
+            <w:pPr>
+              <w:bidi/>
+              <w:spacing w:after="80"/>
+              <w:jc w:val="both"/>
+            </w:pPr>
+            <w:r>
+              <w:rPr>
+                <w:rtl/>
+                <w:rFonts w:cs="Scheherazade New"/>
+              </w:rPr>
+              <w:t xml:space="preserve">بیار باده که بنیاد عمر بر باد است</w:t>
+            </w:r>
+          </w:p>
+        </w:tc>
+      </w:tr>
+    </w:tbl>
+    <w:p/>
+    <w:tbl>
+      <w:tblPr>
+        <w:tblW w:w="0" w:type="auto"/>
+        <w:jc w:val="center"/>
+        <w:tblBorders>
+          <w:top w:val="none" w:sz="0" w:space="0" w:color="auto"/>
+          <w:left w:val="none" w:sz="0" w:space="0" w:color="auto"/>
+          <w:bottom w:val="none" w:sz="0" w:space="0" w:color="auto"/>
+          <w:right w:val="none" w:sz="0" w:space="0" w:color="auto"/>
+          <w:insideH w:val="none" w:sz="0" w:space="0" w:color="auto"/>
+          <w:insideV w:val="none" w:sz="0" w:space="0" w:color="auto"/>
+        </w:tblBorders>
+        <w:bidiVisual/>
+      </w:tblPr>
+      <w:tblGrid>
+        <w:gridCol w:w="1337"/>
+        <w:gridCol w:w="1337"/>
+        <w:gridCol w:w="1337"/>
+        <w:gridCol w:w="1337"/>
+        <w:gridCol w:w="1337"/>
+        <w:gridCol w:w="1337"/>
+        <w:gridCol w:w="1337"/>
+      </w:tblGrid>
+      <w:tr>
+        <w:tc>
+          <w:tcPr>
+            <w:gridSpan w:val="3"/>
+            <w:tcW w:w="4011" w:type="dxa"/>
+            <w:vAlign w:val="bottom"/>
+          </w:tcPr>
+          <w:p>
+            <w:pPr>
+              <w:bidi/>
+              <w:spacing w:after="80"/>
+              <w:jc w:val="both"/>
+            </w:pPr>
+            <w:r>
+              <w:rPr>
+                <w:rtl/>
+                <w:rFonts w:cs="Scheherazade New"/>
+              </w:rPr>
+              <w:t xml:space="preserve">غلام همت آنم که زیر چرخ کبود</w:t>
+            </w:r>
+          </w:p>
+        </w:tc>
+        <w:tc>
+          <w:tcPr>
+            <w:gridSpan w:val="1"/>
+            <w:tcW w:w="1337" w:type="dxa"/>
+          </w:tcPr>
+          <w:p/>
+        </w:tc>
+        <w:tc>
+          <w:tcPr>
+            <w:gridSpan w:val="3"/>
+            <w:tcW w:w="4011" w:type="dxa"/>
+            <w:vAlign w:val="bottom"/>
+          </w:tcPr>
+          <w:p>
+            <w:pPr>
+              <w:bidi/>
+              <w:spacing w:after="80"/>
+              <w:jc w:val="both"/>
+            </w:pPr>
+            <w:r>
+              <w:rPr>
+                <w:rtl/>
+                <w:rFonts w:cs="Scheherazade New"/>
+              </w:rPr>
+              <w:t xml:space="preserve">ز هر چه رنگ تعلق پذیرد آزاد است</w:t>
+            </w:r>
+          </w:p>
+        </w:tc>
+      </w:tr>
+    </w:tbl>
+    <w:p/>
+    <w:tbl>
+      <w:tblPr>
+        <w:tblW w:w="0" w:type="auto"/>
+        <w:jc w:val="center"/>
+        <w:tblBorders>
+          <w:top w:val="none" w:sz="0" w:space="0" w:color="auto"/>
+          <w:left w:val="none" w:sz="0" w:space="0" w:color="auto"/>
+          <w:bottom w:val="none" w:sz="0" w:space="0" w:color="auto"/>
+          <w:right w:val="none" w:sz="0" w:space="0" w:color="auto"/>
+          <w:insideH w:val="none" w:sz="0" w:space="0" w:color="auto"/>
+          <w:insideV w:val="none" w:sz="0" w:space="0" w:color="auto"/>
+        </w:tblBorders>
+        <w:bidiVisual/>
+      </w:tblPr>
+      <w:tblGrid>
+        <w:gridCol w:w="1337"/>
+        <w:gridCol w:w="1337"/>
+        <w:gridCol w:w="1337"/>
+        <w:gridCol w:w="1337"/>
+        <w:gridCol w:w="1337"/>
+        <w:gridCol w:w="1337"/>
+        <w:gridCol w:w="1337"/>
+      </w:tblGrid>
+      <w:tr>
+        <w:tc>
+          <w:tcPr>
+            <w:gridSpan w:val="3"/>
+            <w:tcW w:w="4011" w:type="dxa"/>
+            <w:vAlign w:val="bottom"/>
+          </w:tcPr>
+          <w:p>
+            <w:pPr>
+              <w:bidi/>
+              <w:spacing w:after="80"/>
+              <w:jc w:val="both"/>
+            </w:pPr>
+            <w:r>
+              <w:rPr>
+                <w:rtl/>
+                <w:rFonts w:cs="Scheherazade New"/>
+              </w:rPr>
+              <w:t xml:space="preserve">چه باشد ار شود افشای راز دلدارم</w:t>
+            </w:r>
+          </w:p>
+        </w:tc>
+        <w:tc>
+          <w:tcPr>
+            <w:gridSpan w:val="1"/>
+            <w:tcW w:w="1337" w:type="dxa"/>
+          </w:tcPr>
+          <w:p/>
+        </w:tc>
+        <w:tc>
+          <w:tcPr>
+            <w:gridSpan w:val="3"/>
+            <w:tcW w:w="4011" w:type="dxa"/>
+            <w:vAlign w:val="bottom"/>
+          </w:tcPr>
+          <w:p>
+            <w:pPr>
+              <w:bidi/>
+              <w:spacing w:after="80"/>
+              <w:jc w:val="both"/>
+            </w:pPr>
+            <w:r>
+              <w:rPr>
+                <w:rtl/>
+                <w:rFonts w:cs="Scheherazade New"/>
+              </w:rPr>
+              <w:t xml:space="preserve">چو عاشقان همه عالم بدین گرفتارند</w:t>
             </w:r>
           </w:p>
         </w:tc>

</xml_diff>